<commit_message>
Finalize Render bonus and submission deliverables
</commit_message>
<xml_diff>
--- a/docs/assessment-notes.docx
+++ b/docs/assessment-notes.docx
@@ -35,8 +35,21 @@
         </w:rPr>
         <w:t xml:space="preserve">Repository: </w:t>
       </w:r>
+      <w:proofErr w:type="spellStart"/>
       <w:r>
-        <w:t>kamka-cloud-devops-assessment</w:t>
+        <w:t>kamka</w:t>
+      </w:r>
+      <w:proofErr w:type="spellEnd"/>
+      <w:r>
+        <w:t>-cloud-</w:t>
+      </w:r>
+      <w:proofErr w:type="spellStart"/>
+      <w:r>
+        <w:t>devops</w:t>
+      </w:r>
+      <w:proofErr w:type="spellEnd"/>
+      <w:r>
+        <w:t>-assessment</w:t>
       </w:r>
     </w:p>
     <w:p>
@@ -49,10 +62,15 @@
     </w:p>
     <w:p>
       <w:r>
-        <w:t xml:space="preserve">This submission implements a minimal three-tier Todo application focused on delivery lifecycle and </w:t>
+        <w:t xml:space="preserve">This submission implements a minimal three-tier </w:t>
       </w:r>
+      <w:proofErr w:type="spellStart"/>
       <w:r>
-        <w:t>operational clarity rather than application complexity.</w:t>
+        <w:t>Todo</w:t>
+      </w:r>
+      <w:proofErr w:type="spellEnd"/>
+      <w:r>
+        <w:t xml:space="preserve"> application focused on delivery lifecycle and operational clarity rather than application complexity.</w:t>
       </w:r>
     </w:p>
     <w:p>
@@ -67,8 +85,34 @@
       <w:pPr>
         <w:pStyle w:val="ListBullet"/>
       </w:pPr>
+      <w:proofErr w:type="spellStart"/>
       <w:r>
-        <w:t>api: Spring Boot REST API exposing Todo endpoints and health checks</w:t>
+        <w:t>api</w:t>
+      </w:r>
+      <w:proofErr w:type="spellEnd"/>
+      <w:r>
+        <w:t xml:space="preserve">: Spring Boot REST API exposing </w:t>
+      </w:r>
+      <w:proofErr w:type="spellStart"/>
+      <w:r>
+        <w:t>Todo</w:t>
+      </w:r>
+      <w:proofErr w:type="spellEnd"/>
+      <w:r>
+        <w:t xml:space="preserve"> endpoints and health checks</w:t>
+      </w:r>
+    </w:p>
+    <w:p>
+      <w:pPr>
+        <w:pStyle w:val="ListBullet"/>
+      </w:pPr>
+      <w:proofErr w:type="spellStart"/>
+      <w:r>
+        <w:t>db</w:t>
+      </w:r>
+      <w:proofErr w:type="spellEnd"/>
+      <w:r>
+        <w:t>: PostgreSQL persistence layer</w:t>
       </w:r>
     </w:p>
     <w:p>
@@ -76,18 +120,7 @@
         <w:pStyle w:val="ListBullet"/>
       </w:pPr>
       <w:r>
-        <w:t>db: PostgreSQL persistence layer</w:t>
-      </w:r>
-    </w:p>
-    <w:p>
-      <w:pPr>
-        <w:pStyle w:val="ListBullet"/>
-      </w:pPr>
-      <w:r>
-        <w:t>monitoring: Uptime Kuma watching the run</w:t>
-      </w:r>
-      <w:r>
-        <w:t>ning stack</w:t>
+        <w:t>monitoring: Uptime Kuma watching the running stack</w:t>
       </w:r>
     </w:p>
     <w:p>
@@ -118,10 +151,7 @@
     </w:p>
     <w:p>
       <w:r>
-        <w:t>3. If t</w:t>
-      </w:r>
-      <w:r>
-        <w:t>ests pass, Docker images for the API and frontend are built.</w:t>
+        <w:t>3. If tests pass, Docker images for the API and frontend are built.</w:t>
       </w:r>
     </w:p>
     <w:p>
@@ -131,10 +161,15 @@
     </w:p>
     <w:p>
       <w:r>
-        <w:t>5. On main, the deploy job runs and still documents the reproducible local-first pr</w:t>
+        <w:t>5. On main, the deploy job runs and still documents the reproducible local-first production path through docker-</w:t>
       </w:r>
+      <w:proofErr w:type="spellStart"/>
       <w:r>
-        <w:t>oduction path through docker-compose.prod.yml and scripts/deploy.sh.</w:t>
+        <w:t>compose.prod.yml</w:t>
+      </w:r>
+      <w:proofErr w:type="spellEnd"/>
+      <w:r>
+        <w:t xml:space="preserve"> and scripts/deploy.sh.</w:t>
       </w:r>
     </w:p>
     <w:p>
@@ -147,10 +182,7 @@
         <w:pStyle w:val="Heading1"/>
       </w:pPr>
       <w:r>
-        <w:t>Key Decisions and T</w:t>
-      </w:r>
-      <w:r>
-        <w:t>rade-offs</w:t>
+        <w:t>Key Decisions and Trade-offs</w:t>
       </w:r>
     </w:p>
     <w:p>
@@ -172,10 +204,7 @@
         <w:t xml:space="preserve">Spring Boot API: </w:t>
       </w:r>
       <w:r>
-        <w:t>Spring Boot provides a realistic backend shape with health checks, Post</w:t>
-      </w:r>
-      <w:r>
-        <w:t>greSQL integration, and a familiar build pipeline without unnecessary application complexity.</w:t>
+        <w:t>Spring Boot provides a realistic backend shape with health checks, PostgreSQL integration, and a familiar build pipeline without unnecessary application complexity.</w:t>
       </w:r>
     </w:p>
     <w:p>
@@ -197,10 +226,7 @@
         <w:t xml:space="preserve">GitHub Actions: </w:t>
       </w:r>
       <w:r>
-        <w:t>GitHub Actions k</w:t>
-      </w:r>
-      <w:r>
-        <w:t>eeps the pipeline close to the repository and clearly expresses the stages: test, build, publish, and deploy trigger.</w:t>
+        <w:t>GitHub Actions keeps the pipeline close to the repository and clearly expresses the stages: test, build, publish, and deploy trigger.</w:t>
       </w:r>
     </w:p>
     <w:p>
@@ -211,10 +237,7 @@
         <w:t xml:space="preserve">Uptime Kuma: </w:t>
       </w:r>
       <w:r>
-        <w:t>Uptime Kuma is lightweight and easy to demonstrate locally. It directly answers whether the frontend, API, and database are a</w:t>
-      </w:r>
-      <w:r>
-        <w:t>vailable.</w:t>
+        <w:t>Uptime Kuma is lightweight and easy to demonstrate locally. It directly answers whether the frontend, API, and database are available.</w:t>
       </w:r>
     </w:p>
     <w:p>
@@ -225,7 +248,23 @@
         <w:t xml:space="preserve">Secrets handling: </w:t>
       </w:r>
       <w:r>
-        <w:t>Secrets stay in local .env files or GitHub Actions secrets, while .env.example documents the required variables without exposing real credentials.</w:t>
+        <w:t xml:space="preserve">Secrets stay in local .env files or GitHub Actions secrets, </w:t>
+      </w:r>
+      <w:proofErr w:type="gramStart"/>
+      <w:r>
+        <w:t>while .</w:t>
+      </w:r>
+      <w:proofErr w:type="spellStart"/>
+      <w:r>
+        <w:t>env</w:t>
+      </w:r>
+      <w:proofErr w:type="gramEnd"/>
+      <w:r>
+        <w:t>.example</w:t>
+      </w:r>
+      <w:proofErr w:type="spellEnd"/>
+      <w:r>
+        <w:t xml:space="preserve"> documents the required variables without exposing real credentials.</w:t>
       </w:r>
     </w:p>
     <w:p>
@@ -239,10 +278,7 @@
     </w:p>
     <w:p>
       <w:r>
-        <w:t>Development and production use the same core runtime shape: Ngi</w:t>
-      </w:r>
-      <w:r>
-        <w:t>nx frontend, Spring Boot API, PostgreSQL, and Uptime Kuma. The main difference is image source.</w:t>
+        <w:t>Development and production use the same core runtime shape: Nginx frontend, Spring Boot API, PostgreSQL, and Uptime Kuma. The main difference is image source.</w:t>
       </w:r>
     </w:p>
     <w:p>
@@ -258,11 +294,13 @@
         <w:pStyle w:val="ListBullet"/>
       </w:pPr>
       <w:r>
-        <w:t xml:space="preserve">production pulls versioned images from Docker Hub with </w:t>
+        <w:t>production pulls versioned images from Docker Hub with docker-</w:t>
       </w:r>
+      <w:proofErr w:type="spellStart"/>
       <w:r>
-        <w:t>docker-compose.prod.yml</w:t>
+        <w:t>compose.prod.yml</w:t>
       </w:r>
+      <w:proofErr w:type="spellEnd"/>
     </w:p>
     <w:p>
       <w:pPr>
@@ -293,10 +331,15 @@
         <w:pStyle w:val="ListBullet"/>
       </w:pPr>
       <w:r>
-        <w:t>docker compose -f docker-compose.prod.yml --env</w:t>
+        <w:t>docker compose -f docker-</w:t>
       </w:r>
+      <w:proofErr w:type="spellStart"/>
       <w:r>
-        <w:t>-file .env up -d starts the production profile successfully</w:t>
+        <w:t>compose.prod.yml</w:t>
+      </w:r>
+      <w:proofErr w:type="spellEnd"/>
+      <w:r>
+        <w:t xml:space="preserve"> --env-file .env up -d starts the production profile successfully</w:t>
       </w:r>
     </w:p>
     <w:p>
@@ -328,10 +371,7 @@
         <w:pStyle w:val="ListBullet"/>
       </w:pPr>
       <w:r>
-        <w:t>Uptime Kuma is reachable on http://localhost:</w:t>
-      </w:r>
-      <w:r>
-        <w:t>3001 and monitors frontend, API, and PostgreSQL</w:t>
+        <w:t>Uptime Kuma is reachable on http://localhost:3001 and monitors frontend, API, and PostgreSQL</w:t>
       </w:r>
     </w:p>
     <w:p>
@@ -347,7 +387,31 @@
         <w:pStyle w:val="ListBullet"/>
       </w:pPr>
       <w:r>
-        <w:t>Docker Hub contains public repositories for kamka-todo-api and kamka-todo-frontend</w:t>
+        <w:t xml:space="preserve">Docker Hub contains public repositories for </w:t>
+      </w:r>
+      <w:proofErr w:type="spellStart"/>
+      <w:r>
+        <w:t>kamka-todo-api</w:t>
+      </w:r>
+      <w:proofErr w:type="spellEnd"/>
+      <w:r>
+        <w:t xml:space="preserve"> and </w:t>
+      </w:r>
+      <w:proofErr w:type="spellStart"/>
+      <w:r>
+        <w:t>kamka</w:t>
+      </w:r>
+      <w:proofErr w:type="spellEnd"/>
+      <w:r>
+        <w:t>-</w:t>
+      </w:r>
+      <w:proofErr w:type="spellStart"/>
+      <w:r>
+        <w:t>todo</w:t>
+      </w:r>
+      <w:proofErr w:type="spellEnd"/>
+      <w:r>
+        <w:t>-frontend</w:t>
       </w:r>
     </w:p>
     <w:p>
@@ -360,10 +424,7 @@
     </w:p>
     <w:p>
       <w:r>
-        <w:t>The most</w:t>
-      </w:r>
-      <w:r>
-        <w:t xml:space="preserve"> relevant validation screenshots are embedded below because the submission form does not provide separate screenshot upload slots.</w:t>
+        <w:t>The most relevant validation screenshots are embedded below because the submission form does not provide separate screenshot upload slots.</w:t>
       </w:r>
     </w:p>
     <w:p>
@@ -372,9 +433,9 @@
           <w:noProof/>
         </w:rPr>
         <w:drawing>
-          <wp:inline distT="0" distB="0" distL="0" distR="0" wp14:anchorId="26F19168" wp14:editId="1C63F9C8">
-            <wp:extent cx="5486400" cy="2623805"/>
-            <wp:effectExtent l="0" t="0" r="0" b="0"/>
+          <wp:inline distT="0" distB="0" distL="0" distR="0" wp14:anchorId="6BE4F7F8" wp14:editId="2026AE2A">
+            <wp:extent cx="6532731" cy="3124200"/>
+            <wp:effectExtent l="0" t="0" r="1905" b="0"/>
             <wp:docPr id="1" name="Picture 1"/>
             <wp:cNvGraphicFramePr>
               <a:graphicFrameLocks xmlns:a="http://schemas.openxmlformats.org/drawingml/2006/main" noChangeAspect="1"/>
@@ -395,7 +456,7 @@
                   <pic:spPr>
                     <a:xfrm>
                       <a:off x="0" y="0"/>
-                      <a:ext cx="5486400" cy="2623805"/>
+                      <a:ext cx="6539231" cy="3127309"/>
                     </a:xfrm>
                     <a:prstGeom prst="rect">
                       <a:avLst/>
@@ -431,9 +492,9 @@
           <w:noProof/>
         </w:rPr>
         <w:drawing>
-          <wp:inline distT="0" distB="0" distL="0" distR="0" wp14:anchorId="42722D92" wp14:editId="314B118E">
-            <wp:extent cx="5486400" cy="2753269"/>
-            <wp:effectExtent l="0" t="0" r="0" b="0"/>
+          <wp:inline distT="0" distB="0" distL="0" distR="0" wp14:anchorId="780A8DCD" wp14:editId="6A35E220">
+            <wp:extent cx="6358411" cy="3190875"/>
+            <wp:effectExtent l="0" t="0" r="4445" b="0"/>
             <wp:docPr id="2" name="Picture 2"/>
             <wp:cNvGraphicFramePr>
               <a:graphicFrameLocks xmlns:a="http://schemas.openxmlformats.org/drawingml/2006/main" noChangeAspect="1"/>
@@ -454,7 +515,7 @@
                   <pic:spPr>
                     <a:xfrm>
                       <a:off x="0" y="0"/>
-                      <a:ext cx="5486400" cy="2753269"/>
+                      <a:ext cx="6364948" cy="3194156"/>
                     </a:xfrm>
                     <a:prstGeom prst="rect">
                       <a:avLst/>
@@ -484,9 +545,9 @@
           <w:noProof/>
         </w:rPr>
         <w:drawing>
-          <wp:inline distT="0" distB="0" distL="0" distR="0" wp14:anchorId="27ED546C" wp14:editId="56CC72EC">
-            <wp:extent cx="5486400" cy="2633932"/>
-            <wp:effectExtent l="0" t="0" r="0" b="0"/>
+          <wp:inline distT="0" distB="0" distL="0" distR="0" wp14:anchorId="31B50E76" wp14:editId="2C1F2FFC">
+            <wp:extent cx="6487773" cy="3114675"/>
+            <wp:effectExtent l="0" t="0" r="8890" b="0"/>
             <wp:docPr id="3" name="Picture 3"/>
             <wp:cNvGraphicFramePr>
               <a:graphicFrameLocks xmlns:a="http://schemas.openxmlformats.org/drawingml/2006/main" noChangeAspect="1"/>
@@ -507,7 +568,7 @@
                   <pic:spPr>
                     <a:xfrm>
                       <a:off x="0" y="0"/>
-                      <a:ext cx="5486400" cy="2633932"/>
+                      <a:ext cx="6494510" cy="3117909"/>
                     </a:xfrm>
                     <a:prstGeom prst="rect">
                       <a:avLst/>
@@ -528,26 +589,23 @@
         <w:rPr>
           <w:i/>
         </w:rPr>
-        <w:t xml:space="preserve">Uptime Kuma </w:t>
-      </w:r>
-      <w:r>
-        <w:rPr>
-          <w:i/>
-        </w:rPr>
-        <w:t>monitoring the full stack with three healthy checks</w:t>
+        <w:t>Uptime Kuma monitoring the full stack with three healthy checks</w:t>
       </w:r>
     </w:p>
     <w:p>
+      <w:pPr>
+        <w:jc w:val="center"/>
+      </w:pPr>
       <w:r>
         <w:rPr>
           <w:noProof/>
         </w:rPr>
         <w:lastRenderedPageBreak/>
         <w:drawing>
-          <wp:inline distT="0" distB="0" distL="0" distR="0" wp14:anchorId="7C61B0B5" wp14:editId="4AC4FBF3">
-            <wp:extent cx="5486400" cy="2764687"/>
+          <wp:inline distT="0" distB="0" distL="0" distR="0" wp14:anchorId="1D9AA938" wp14:editId="2AFA55DE">
+            <wp:extent cx="6631528" cy="3829050"/>
             <wp:effectExtent l="0" t="0" r="0" b="0"/>
-            <wp:docPr id="4" name="Picture 4"/>
+            <wp:docPr id="7" name="Picture 7"/>
             <wp:cNvGraphicFramePr>
               <a:graphicFrameLocks xmlns:a="http://schemas.openxmlformats.org/drawingml/2006/main" noChangeAspect="1"/>
             </wp:cNvGraphicFramePr>
@@ -555,23 +613,30 @@
               <a:graphicData uri="http://schemas.openxmlformats.org/drawingml/2006/picture">
                 <pic:pic xmlns:pic="http://schemas.openxmlformats.org/drawingml/2006/picture">
                   <pic:nvPicPr>
-                    <pic:cNvPr id="0" name="Capture d'écran 2026-06-04 153225.png"/>
+                    <pic:cNvPr id="0" name="image.png"/>
                     <pic:cNvPicPr/>
                   </pic:nvPicPr>
-                  <pic:blipFill>
+                  <pic:blipFill rotWithShape="1">
                     <a:blip r:embed="rId11"/>
-                    <a:stretch>
-                      <a:fillRect/>
-                    </a:stretch>
+                    <a:srcRect l="6554" t="44060" r="12327" b="5304"/>
+                    <a:stretch/>
                   </pic:blipFill>
-                  <pic:spPr>
+                  <pic:spPr bwMode="auto">
                     <a:xfrm>
                       <a:off x="0" y="0"/>
-                      <a:ext cx="5486400" cy="2764687"/>
+                      <a:ext cx="6659219" cy="3845039"/>
                     </a:xfrm>
                     <a:prstGeom prst="rect">
                       <a:avLst/>
                     </a:prstGeom>
+                    <a:ln>
+                      <a:noFill/>
+                    </a:ln>
+                    <a:extLst>
+                      <a:ext uri="{53640926-AAD7-44D8-BBD7-CCE9431645EC}">
+                        <a14:shadowObscured xmlns:a14="http://schemas.microsoft.com/office/drawing/2010/main"/>
+                      </a:ext>
+                    </a:extLst>
                   </pic:spPr>
                 </pic:pic>
               </a:graphicData>
@@ -587,61 +652,9 @@
       <w:r>
         <w:rPr>
           <w:i/>
+          <w:sz w:val="18"/>
         </w:rPr>
-        <w:t>Frontend application running locally</w:t>
-      </w:r>
-    </w:p>
-    <w:p>
-      <w:r>
-        <w:rPr>
-          <w:noProof/>
-        </w:rPr>
-        <w:drawing>
-          <wp:inline distT="0" distB="0" distL="0" distR="0" wp14:anchorId="02027E36" wp14:editId="34B0846E">
-            <wp:extent cx="4572000" cy="1721315"/>
-            <wp:effectExtent l="0" t="0" r="0" b="0"/>
-            <wp:docPr id="5" name="Picture 5"/>
-            <wp:cNvGraphicFramePr>
-              <a:graphicFrameLocks xmlns:a="http://schemas.openxmlformats.org/drawingml/2006/main" noChangeAspect="1"/>
-            </wp:cNvGraphicFramePr>
-            <a:graphic xmlns:a="http://schemas.openxmlformats.org/drawingml/2006/main">
-              <a:graphicData uri="http://schemas.openxmlformats.org/drawingml/2006/picture">
-                <pic:pic xmlns:pic="http://schemas.openxmlformats.org/drawingml/2006/picture">
-                  <pic:nvPicPr>
-                    <pic:cNvPr id="0" name="API health response.png"/>
-                    <pic:cNvPicPr/>
-                  </pic:nvPicPr>
-                  <pic:blipFill>
-                    <a:blip r:embed="rId12"/>
-                    <a:stretch>
-                      <a:fillRect/>
-                    </a:stretch>
-                  </pic:blipFill>
-                  <pic:spPr>
-                    <a:xfrm>
-                      <a:off x="0" y="0"/>
-                      <a:ext cx="4572000" cy="1721315"/>
-                    </a:xfrm>
-                    <a:prstGeom prst="rect">
-                      <a:avLst/>
-                    </a:prstGeom>
-                  </pic:spPr>
-                </pic:pic>
-              </a:graphicData>
-            </a:graphic>
-          </wp:inline>
-        </w:drawing>
-      </w:r>
-    </w:p>
-    <w:p>
-      <w:pPr>
-        <w:jc w:val="center"/>
-      </w:pPr>
-      <w:r>
-        <w:rPr>
-          <w:i/>
-        </w:rPr>
-        <w:t>Spring Boot health endpoint responding with UP status</w:t>
+        <w:t>Optional bonus live deployment on Render: production overview and public frontend working end to end.</w:t>
       </w:r>
     </w:p>
     <w:p>
@@ -657,7 +670,15 @@
         <w:pStyle w:val="ListBullet"/>
       </w:pPr>
       <w:r>
-        <w:t>Uptime Kuma monitors are created manually on first boot rather than auto-provisioned.</w:t>
+        <w:t xml:space="preserve">Uptime Kuma monitors are created manually on first boot rather than </w:t>
+      </w:r>
+      <w:proofErr w:type="gramStart"/>
+      <w:r>
+        <w:t>auto-provisioned</w:t>
+      </w:r>
+      <w:proofErr w:type="gramEnd"/>
+      <w:r>
+        <w:t>.</w:t>
       </w:r>
     </w:p>
     <w:p>
@@ -665,10 +686,7 @@
         <w:pStyle w:val="ListBullet"/>
       </w:pPr>
       <w:r>
-        <w:t>A vis</w:t>
-      </w:r>
-      <w:r>
-        <w:t>ible public live host is not provisioned yet; the deploy job currently demonstrates reproducible deployment plus optional remote execution.</w:t>
+        <w:t>The optional Render deployment now exposes a public live host, while Docker Compose remains the primary reproducible environment.</w:t>
       </w:r>
     </w:p>
     <w:p>
@@ -676,7 +694,7 @@
         <w:pStyle w:val="ListBullet"/>
       </w:pPr>
       <w:r>
-        <w:t>HTTPS was left out because it is optional once the core requirements are complete.</w:t>
+        <w:t>Render-managed HTTPS is active on the public frontend and API endpoints; the local stack intentionally stays HTTP-only.</w:t>
       </w:r>
     </w:p>
     <w:p>
@@ -684,10 +702,7 @@
         <w:pStyle w:val="ListBullet"/>
       </w:pPr>
       <w:r>
-        <w:t>Rollback is manual through previo</w:t>
-      </w:r>
-      <w:r>
-        <w:t>usly published image tags rather than automated.</w:t>
+        <w:t>Rollback is manual through previously published image tags rather than automated.</w:t>
       </w:r>
     </w:p>
     <w:p>
@@ -703,7 +718,7 @@
         <w:pStyle w:val="Heading1"/>
       </w:pPr>
       <w:r>
-        <w:t>What I Would Improve With More Time</w:t>
+        <w:t>Optional Bonus: Live Deployment on Render</w:t>
       </w:r>
     </w:p>
     <w:p>
@@ -711,13 +726,31 @@
         <w:pStyle w:val="ListBullet"/>
       </w:pPr>
       <w:r>
-        <w:t xml:space="preserve">Provision a small public Linux host and </w:t>
+        <w:t xml:space="preserve">A public Render project now hosts </w:t>
       </w:r>
+      <w:proofErr w:type="spellStart"/>
       <w:r>
-        <w:t>complete a live deployment.</w:t>
+        <w:t>kamka-api</w:t>
       </w:r>
+      <w:proofErr w:type="spellEnd"/>
       <w:r>
-        <w:t>.</w:t>
+        <w:t xml:space="preserve">, </w:t>
+      </w:r>
+      <w:proofErr w:type="spellStart"/>
+      <w:r>
+        <w:t>kamka</w:t>
+      </w:r>
+      <w:proofErr w:type="spellEnd"/>
+      <w:r>
+        <w:t xml:space="preserve">-frontend, and </w:t>
+      </w:r>
+      <w:proofErr w:type="spellStart"/>
+      <w:r>
+        <w:t>kamka-postgres</w:t>
+      </w:r>
+      <w:proofErr w:type="spellEnd"/>
+      <w:r>
+        <w:t xml:space="preserve"> in Frankfurt.</w:t>
       </w:r>
     </w:p>
     <w:p>
@@ -725,7 +758,15 @@
         <w:pStyle w:val="ListBullet"/>
       </w:pPr>
       <w:r>
-        <w:t>Introduce a backup script and recovery notes for PostgreSQL.</w:t>
+        <w:t xml:space="preserve">The live frontend successfully creates, completes, reopens, refreshes, and deletes </w:t>
+      </w:r>
+      <w:proofErr w:type="spellStart"/>
+      <w:r>
+        <w:t>todos</w:t>
+      </w:r>
+      <w:proofErr w:type="spellEnd"/>
+      <w:r>
+        <w:t xml:space="preserve"> against the hosted API.</w:t>
       </w:r>
     </w:p>
     <w:p>
@@ -733,7 +774,7 @@
         <w:pStyle w:val="ListBullet"/>
       </w:pPr>
       <w:r>
-        <w:t>Add release-tag-based rollback automation.</w:t>
+        <w:t>The Render free tier remains subject to cold starts after inactivity and a 30-day PostgreSQL expiry window.</w:t>
       </w:r>
     </w:p>
     <w:p>
@@ -741,11 +782,11 @@
         <w:pStyle w:val="ListBullet"/>
       </w:pPr>
       <w:r>
-        <w:t>Add infrastructure automation with Terraform or Ansible if the scope expands.</w:t>
+        <w:t>Future improvements would focus on custom domains, backup automation, and rollback orchestration rather than basic hosting.</w:t>
       </w:r>
     </w:p>
     <w:sectPr>
-      <w:headerReference w:type="default" r:id="rId13"/>
+      <w:headerReference w:type="default" r:id="rId12"/>
       <w:pgSz w:w="12240" w:h="15840"/>
       <w:pgMar w:top="864" w:right="1008" w:bottom="864" w:left="1008" w:header="400" w:footer="720" w:gutter="0"/>
       <w:cols w:space="720"/>
@@ -830,7 +871,21 @@
       <w:rPr>
         <w:sz w:val="18"/>
       </w:rPr>
-      <w:t>+216 95 827 073 | ihebbelaid3@gmail.com | linkedin.com/in/iheb-belaid/</w:t>
+      <w:t>+216 95 827 073 | ihebbelaid3@gmail.com | linkedin.com/in/</w:t>
+    </w:r>
+    <w:proofErr w:type="spellStart"/>
+    <w:r>
+      <w:rPr>
+        <w:sz w:val="18"/>
+      </w:rPr>
+      <w:t>iheb-belaid</w:t>
+    </w:r>
+    <w:proofErr w:type="spellEnd"/>
+    <w:r>
+      <w:rPr>
+        <w:sz w:val="18"/>
+      </w:rPr>
+      <w:t>/</w:t>
     </w:r>
   </w:p>
 </w:hdr>
@@ -1324,11 +1379,6 @@
     <w:lsdException w:name="Book Title" w:uiPriority="33" w:qFormat="1"/>
     <w:lsdException w:name="Bibliography" w:semiHidden="1" w:uiPriority="37" w:unhideWhenUsed="1"/>
     <w:lsdException w:name="TOC Heading" w:semiHidden="1" w:uiPriority="39" w:unhideWhenUsed="1" w:qFormat="1"/>
-    <w:lsdException w:name="Plain Table 5" w:semiHidden="1" w:unhideWhenUsed="1"/>
-    <w:lsdException w:name="Grid Table Light" w:semiHidden="1" w:unhideWhenUsed="1"/>
-    <w:lsdException w:name="Grid Table 1 Light" w:semiHidden="1" w:unhideWhenUsed="1"/>
-    <w:lsdException w:name="Grid Table 2" w:semiHidden="1" w:unhideWhenUsed="1"/>
-    <w:lsdException w:name="Grid Table 3" w:semiHidden="1" w:unhideWhenUsed="1"/>
     <w:lsdException w:name="Grid Table 4" w:uiPriority="49"/>
     <w:lsdException w:name="Grid Table 5 Dark" w:uiPriority="50"/>
     <w:lsdException w:name="Grid Table 6 Colorful" w:uiPriority="51"/>

</xml_diff>